<commit_message>
fix: posicionamiento corregido SA_04 SA_06 SA_07 SA_08 SA_09 SA_10 SA_11 + html actualizados
</commit_message>
<xml_diff>
--- a/skin-analyzer/fichas-parametros/docx/SA_04_SURFACE_RENEWAL_PROTOCOL.docx
+++ b/skin-analyzer/fichas-parametros/docx/SA_04_SURFACE_RENEWAL_PROTOCOL.docx
@@ -269,7 +269,7 @@
                 <w:sz w:val="20"/>
                 <w:szCs w:val="20"/>
               </w:rPr>
-              <w:t xml:space="preserve">No vendes un cosmético anti-edad.</w:t>
+              <w:t xml:space="preserve">No estás vendiendo un exfoliante.</w:t>
             </w:r>
           </w:p>
           <w:p>
@@ -315,7 +315,7 @@
                 <w:sz w:val="20"/>
                 <w:szCs w:val="20"/>
               </w:rPr>
-              <w:t xml:space="preserve">No vendes un cosmético anti-edad.</w:t>
+              <w:t xml:space="preserve">La diferencia:</w:t>
             </w:r>
           </w:p>
           <w:p>
@@ -333,7 +333,7 @@
                 <w:sz w:val="20"/>
                 <w:szCs w:val="20"/>
               </w:rPr>
-              <w:t xml:space="preserve">Vendes un sistema de lectura y modulación de la trayectoria estructural del rostro.</w:t>
+              <w:t xml:space="preserve">Exfoliar más fuerte destruye la barrera. Renovar desde dentro la activa.</w:t>
             </w:r>
           </w:p>
         </w:tc>

</xml_diff>